<commit_message>
Remover compromissos de timing e envio ao formador (páginas e fichas)
</commit_message>
<xml_diff>
--- a/fichas/Ficha_M1_McFarlan.docx
+++ b/fichas/Ficha_M1_McFarlan.docx
@@ -40,7 +40,7 @@
           <w:sz w:val="21"/>
           <w:szCs w:val="21"/>
         </w:rPr>
-        <w:t xml:space="preserve">Matriz de McFarlan · Caso InterMed (exercício 1) · entrega antes da Sessão 2 (qua, 15 jul)</w:t>
+        <w:t xml:space="preserve">Matriz de McFarlan · Caso InterMed (exercício 1)</w:t>
       </w:r>
     </w:p>
     <w:p>
@@ -133,7 +133,7 @@
               <w:spacing w:after="60"/>
             </w:pPr>
             <w:r>
-              <w:t xml:space="preserve">3. Envia esta ficha ao formador antes da Sessão 2 (quarta, 15 de julho), conforme combinado em sala.</w:t>
+              <w:t xml:space="preserve">3. Guarda a ficha preenchida — será discutida em aula.</w:t>
             </w:r>
           </w:p>
         </w:tc>

</xml_diff>